<commit_message>
Add book cover and rebuild all three exports with cover image
- SoftwareEngineeringWithAi.png: original cover (9.8M)
- cover-optimized.png: 1200px resized for PDF/docx (2.2M)
- cover.md: cover page markdown (prepended to docx/pdf builds)
- AgentFlow.epub: 9.1M (--epub-cover-image with full-res PNG)
- AgentFlow.docx: 2.3M (cover page as first page)
- AgentFlow.pdf: 2.4M (cover page via weasyprint)

Co-Authored-By: Claude Sonnet 4.6 <noreply@anthropic.com>
</commit_message>
<xml_diff>
--- a/chapters/AgentFlow.docx
+++ b/chapters/AgentFlow.docx
@@ -44,7 +44,62 @@
         </w:p>
       </w:sdtContent>
     </w:sdt>
-    <w:bookmarkStart w:id="17" w:name="introduction"/>
+    <w:p>
+      <w:pPr>
+        <w:pStyle w:val="CaptionedFigure"/>
+      </w:pPr>
+      <w:r>
+        <w:drawing>
+          <wp:inline>
+            <wp:extent cx="5334000" cy="7143750"/>
+            <wp:effectExtent b="0" l="0" r="0" t="0"/>
+            <wp:docPr descr="Cover" title="" id="10" name="Picture"/>
+            <a:graphic>
+              <a:graphicData uri="http://schemas.openxmlformats.org/drawingml/2006/picture">
+                <pic:pic>
+                  <pic:nvPicPr>
+                    <pic:cNvPr descr="cover-optimized.png" id="11" name="Picture"/>
+                    <pic:cNvPicPr>
+                      <a:picLocks noChangeArrowheads="1" noChangeAspect="1"/>
+                    </pic:cNvPicPr>
+                  </pic:nvPicPr>
+                  <pic:blipFill>
+                    <a:blip r:embed="rId9"/>
+                    <a:stretch>
+                      <a:fillRect/>
+                    </a:stretch>
+                  </pic:blipFill>
+                  <pic:spPr bwMode="auto">
+                    <a:xfrm>
+                      <a:off x="0" y="0"/>
+                      <a:ext cx="5334000" cy="7143750"/>
+                    </a:xfrm>
+                    <a:prstGeom prst="rect">
+                      <a:avLst/>
+                    </a:prstGeom>
+                    <a:noFill/>
+                    <a:ln w="9525">
+                      <a:noFill/>
+                      <a:headEnd/>
+                      <a:tailEnd/>
+                    </a:ln>
+                  </pic:spPr>
+                </pic:pic>
+              </a:graphicData>
+            </a:graphic>
+          </wp:inline>
+        </w:drawing>
+      </w:r>
+    </w:p>
+    <w:p>
+      <w:pPr>
+        <w:pStyle w:val="ImageCaption"/>
+      </w:pPr>
+      <w:r>
+        <w:t xml:space="preserve">Cover</w:t>
+      </w:r>
+    </w:p>
+    <w:bookmarkStart w:id="20" w:name="introduction"/>
     <w:p>
       <w:pPr>
         <w:pStyle w:val="Heading1"/>
@@ -84,7 +139,7 @@
         </w:pict>
       </w:r>
     </w:p>
-    <w:bookmarkStart w:id="9" w:name="the-discipline-problem"/>
+    <w:bookmarkStart w:id="12" w:name="the-discipline-problem"/>
     <w:p>
       <w:pPr>
         <w:pStyle w:val="Heading2"/>
@@ -158,8 +213,8 @@
         </w:pict>
       </w:r>
     </w:p>
-    <w:bookmarkEnd w:id="9"/>
-    <w:bookmarkStart w:id="10" w:name="this-book"/>
+    <w:bookmarkEnd w:id="12"/>
+    <w:bookmarkStart w:id="13" w:name="this-book"/>
     <w:p>
       <w:pPr>
         <w:pStyle w:val="Heading2"/>
@@ -227,8 +282,8 @@
         </w:pict>
       </w:r>
     </w:p>
-    <w:bookmarkEnd w:id="10"/>
-    <w:bookmarkStart w:id="11" w:name="the-project-thread"/>
+    <w:bookmarkEnd w:id="13"/>
+    <w:bookmarkStart w:id="14" w:name="the-project-thread"/>
     <w:p>
       <w:pPr>
         <w:pStyle w:val="Heading2"/>
@@ -376,8 +431,8 @@
         </w:pict>
       </w:r>
     </w:p>
-    <w:bookmarkEnd w:id="11"/>
-    <w:bookmarkStart w:id="12" w:name="how-part-1-works"/>
+    <w:bookmarkEnd w:id="14"/>
+    <w:bookmarkStart w:id="15" w:name="how-part-1-works"/>
     <w:p>
       <w:pPr>
         <w:pStyle w:val="Heading2"/>
@@ -425,8 +480,8 @@
         </w:pict>
       </w:r>
     </w:p>
-    <w:bookmarkEnd w:id="12"/>
-    <w:bookmarkStart w:id="13" w:name="how-part-2-works"/>
+    <w:bookmarkEnd w:id="15"/>
+    <w:bookmarkStart w:id="16" w:name="how-part-2-works"/>
     <w:p>
       <w:pPr>
         <w:pStyle w:val="Heading2"/>
@@ -474,8 +529,8 @@
         </w:pict>
       </w:r>
     </w:p>
-    <w:bookmarkEnd w:id="13"/>
-    <w:bookmarkStart w:id="15" w:name="before-you-begin"/>
+    <w:bookmarkEnd w:id="16"/>
+    <w:bookmarkStart w:id="18" w:name="before-you-begin"/>
     <w:p>
       <w:pPr>
         <w:pStyle w:val="Heading2"/>
@@ -542,7 +597,7 @@
       <w:r>
         <w:t xml:space="preserve"> </w:t>
       </w:r>
-      <w:hyperlink r:id="rId14">
+      <w:hyperlink r:id="rId17">
         <w:r>
           <w:rPr>
             <w:rStyle w:val="Hyperlink"/>
@@ -656,8 +711,8 @@
         </w:pict>
       </w:r>
     </w:p>
-    <w:bookmarkEnd w:id="15"/>
-    <w:bookmarkStart w:id="16" w:name="lets-start"/>
+    <w:bookmarkEnd w:id="18"/>
+    <w:bookmarkStart w:id="19" w:name="lets-start"/>
     <w:p>
       <w:pPr>
         <w:pStyle w:val="Heading2"/>
@@ -693,9 +748,9 @@
         <w:t xml:space="preserve">The AI is fast. What it builds is only as good as what you specified. This book is about the specifying.</w:t>
       </w:r>
     </w:p>
-    <w:bookmarkEnd w:id="16"/>
-    <w:bookmarkEnd w:id="17"/>
-    <w:bookmarkStart w:id="24" w:name="chapter-1-plan-before-you-prompt"/>
+    <w:bookmarkEnd w:id="19"/>
+    <w:bookmarkEnd w:id="20"/>
+    <w:bookmarkStart w:id="27" w:name="chapter-1-plan-before-you-prompt"/>
     <w:p>
       <w:pPr>
         <w:pStyle w:val="Heading1"/>
@@ -748,7 +803,7 @@
         </w:pict>
       </w:r>
     </w:p>
-    <w:bookmarkStart w:id="18" w:name="why-just-describe-it-doesnt-work"/>
+    <w:bookmarkStart w:id="21" w:name="why-just-describe-it-doesnt-work"/>
     <w:p>
       <w:pPr>
         <w:pStyle w:val="Heading2"/>
@@ -836,8 +891,8 @@
         </w:pict>
       </w:r>
     </w:p>
-    <w:bookmarkEnd w:id="18"/>
-    <w:bookmarkStart w:id="19" w:name="the-project-youll-build"/>
+    <w:bookmarkEnd w:id="21"/>
+    <w:bookmarkStart w:id="22" w:name="the-project-youll-build"/>
     <w:p>
       <w:pPr>
         <w:pStyle w:val="Heading2"/>
@@ -993,8 +1048,8 @@
         </w:pict>
       </w:r>
     </w:p>
-    <w:bookmarkEnd w:id="19"/>
-    <w:bookmarkStart w:id="20" w:name="X97af5601fa25ddd527530e743f89b51dbacd1d0"/>
+    <w:bookmarkEnd w:id="22"/>
+    <w:bookmarkStart w:id="23" w:name="X97af5601fa25ddd527530e743f89b51dbacd1d0"/>
     <w:p>
       <w:pPr>
         <w:pStyle w:val="Heading2"/>
@@ -1031,7 +1086,7 @@
       <w:r>
         <w:t xml:space="preserve"> </w:t>
       </w:r>
-      <w:hyperlink r:id="rId14">
+      <w:hyperlink r:id="rId17">
         <w:r>
           <w:rPr>
             <w:rStyle w:val="Hyperlink"/>
@@ -1254,8 +1309,8 @@
         </w:pict>
       </w:r>
     </w:p>
-    <w:bookmarkEnd w:id="20"/>
-    <w:bookmarkStart w:id="21" w:name="the-planning-brief"/>
+    <w:bookmarkEnd w:id="23"/>
+    <w:bookmarkStart w:id="24" w:name="the-planning-brief"/>
     <w:p>
       <w:pPr>
         <w:pStyle w:val="Heading2"/>
@@ -1919,8 +1974,8 @@
         </w:pict>
       </w:r>
     </w:p>
-    <w:bookmarkEnd w:id="21"/>
-    <w:bookmarkStart w:id="22" w:name="the-success-path-prompting-from-a-plan"/>
+    <w:bookmarkEnd w:id="24"/>
+    <w:bookmarkStart w:id="25" w:name="the-success-path-prompting-from-a-plan"/>
     <w:p>
       <w:pPr>
         <w:pStyle w:val="Heading2"/>
@@ -2480,8 +2535,8 @@
         </w:pict>
       </w:r>
     </w:p>
-    <w:bookmarkEnd w:id="22"/>
-    <w:bookmarkStart w:id="23" w:name="debrief"/>
+    <w:bookmarkEnd w:id="25"/>
+    <w:bookmarkStart w:id="26" w:name="debrief"/>
     <w:p>
       <w:pPr>
         <w:pStyle w:val="Heading2"/>
@@ -2551,9 +2606,9 @@
         <w:t xml:space="preserve">Planning is not a speed bump between you and the AI. It is the thing that makes the AI fast.</w:t>
       </w:r>
     </w:p>
-    <w:bookmarkEnd w:id="23"/>
-    <w:bookmarkEnd w:id="24"/>
-    <w:bookmarkStart w:id="31" w:name="Xb7f453c229a9f86498e68552352387314f121c4"/>
+    <w:bookmarkEnd w:id="26"/>
+    <w:bookmarkEnd w:id="27"/>
+    <w:bookmarkStart w:id="34" w:name="Xb7f453c229a9f86498e68552352387314f121c4"/>
     <w:p>
       <w:pPr>
         <w:pStyle w:val="Heading1"/>
@@ -2611,7 +2666,7 @@
         </w:pict>
       </w:r>
     </w:p>
-    <w:bookmarkStart w:id="25" w:name="Xddae84e35de26e3f7a775ae30af94526d947cee"/>
+    <w:bookmarkStart w:id="28" w:name="Xddae84e35de26e3f7a775ae30af94526d947cee"/>
     <w:p>
       <w:pPr>
         <w:pStyle w:val="Heading2"/>
@@ -2770,8 +2825,8 @@
         </w:pict>
       </w:r>
     </w:p>
-    <w:bookmarkEnd w:id="25"/>
-    <w:bookmarkStart w:id="26" w:name="Xb5197a10d204c6552a2aed7d62dc1dd55530f51"/>
+    <w:bookmarkEnd w:id="28"/>
+    <w:bookmarkStart w:id="29" w:name="Xb5197a10d204c6552a2aed7d62dc1dd55530f51"/>
     <w:p>
       <w:pPr>
         <w:pStyle w:val="Heading2"/>
@@ -3142,8 +3197,8 @@
         </w:pict>
       </w:r>
     </w:p>
-    <w:bookmarkEnd w:id="26"/>
-    <w:bookmarkStart w:id="27" w:name="what-makes-a-requirement-verifiable"/>
+    <w:bookmarkEnd w:id="29"/>
+    <w:bookmarkStart w:id="30" w:name="what-makes-a-requirement-verifiable"/>
     <w:p>
       <w:pPr>
         <w:pStyle w:val="Heading2"/>
@@ -3326,8 +3381,8 @@
         </w:pict>
       </w:r>
     </w:p>
-    <w:bookmarkEnd w:id="27"/>
-    <w:bookmarkStart w:id="28" w:name="writing-the-priority-requirement"/>
+    <w:bookmarkEnd w:id="30"/>
+    <w:bookmarkStart w:id="31" w:name="writing-the-priority-requirement"/>
     <w:p>
       <w:pPr>
         <w:pStyle w:val="Heading2"/>
@@ -3720,8 +3775,8 @@
         </w:pict>
       </w:r>
     </w:p>
-    <w:bookmarkEnd w:id="28"/>
-    <w:bookmarkStart w:id="29" w:name="X5886c6cf591f34dab79e57507b06893ba087f9f"/>
+    <w:bookmarkEnd w:id="31"/>
+    <w:bookmarkStart w:id="32" w:name="X5886c6cf591f34dab79e57507b06893ba087f9f"/>
     <w:p>
       <w:pPr>
         <w:pStyle w:val="Heading2"/>
@@ -4485,8 +4540,8 @@
         </w:pict>
       </w:r>
     </w:p>
-    <w:bookmarkEnd w:id="29"/>
-    <w:bookmarkStart w:id="30" w:name="debrief-1"/>
+    <w:bookmarkEnd w:id="32"/>
+    <w:bookmarkStart w:id="33" w:name="debrief-1"/>
     <w:p>
       <w:pPr>
         <w:pStyle w:val="Heading2"/>
@@ -4564,9 +4619,9 @@
         <w:t xml:space="preserve">The AI executes. You decide what done means. A requirement is how you make that decision stick.</w:t>
       </w:r>
     </w:p>
-    <w:bookmarkEnd w:id="30"/>
-    <w:bookmarkEnd w:id="31"/>
-    <w:bookmarkStart w:id="38" w:name="chapter-3-test-what-the-ai-produces"/>
+    <w:bookmarkEnd w:id="33"/>
+    <w:bookmarkEnd w:id="34"/>
+    <w:bookmarkStart w:id="41" w:name="chapter-3-test-what-the-ai-produces"/>
     <w:p>
       <w:pPr>
         <w:pStyle w:val="Heading1"/>
@@ -4632,7 +4687,7 @@
         </w:pict>
       </w:r>
     </w:p>
-    <w:bookmarkStart w:id="32" w:name="the-trust-problem"/>
+    <w:bookmarkStart w:id="35" w:name="the-trust-problem"/>
     <w:p>
       <w:pPr>
         <w:pStyle w:val="Heading2"/>
@@ -4770,8 +4825,8 @@
         </w:pict>
       </w:r>
     </w:p>
-    <w:bookmarkEnd w:id="32"/>
-    <w:bookmarkStart w:id="33" w:name="Xe701cb9bb9413e5817cb630d1f42054b8e52df7"/>
+    <w:bookmarkEnd w:id="35"/>
+    <w:bookmarkStart w:id="36" w:name="Xe701cb9bb9413e5817cb630d1f42054b8e52df7"/>
     <w:p>
       <w:pPr>
         <w:pStyle w:val="Heading2"/>
@@ -5199,8 +5254,8 @@
         </w:pict>
       </w:r>
     </w:p>
-    <w:bookmarkEnd w:id="33"/>
-    <w:bookmarkStart w:id="34" w:name="X587481522f2aef1653e4f1aa76bdb8c3cbf9995"/>
+    <w:bookmarkEnd w:id="36"/>
+    <w:bookmarkStart w:id="37" w:name="X587481522f2aef1653e4f1aa76bdb8c3cbf9995"/>
     <w:p>
       <w:pPr>
         <w:pStyle w:val="Heading2"/>
@@ -5304,8 +5359,8 @@
         </w:pict>
       </w:r>
     </w:p>
-    <w:bookmarkEnd w:id="34"/>
-    <w:bookmarkStart w:id="35" w:name="the-test-plan"/>
+    <w:bookmarkEnd w:id="37"/>
+    <w:bookmarkStart w:id="38" w:name="the-test-plan"/>
     <w:p>
       <w:pPr>
         <w:pStyle w:val="Heading2"/>
@@ -6114,8 +6169,8 @@
         </w:pict>
       </w:r>
     </w:p>
-    <w:bookmarkEnd w:id="35"/>
-    <w:bookmarkStart w:id="36" w:name="Xa4f7471e821c095f3d2a218d660c54f0a151dc5"/>
+    <w:bookmarkEnd w:id="38"/>
+    <w:bookmarkStart w:id="39" w:name="Xa4f7471e821c095f3d2a218d660c54f0a151dc5"/>
     <w:p>
       <w:pPr>
         <w:pStyle w:val="Heading2"/>
@@ -6696,8 +6751,8 @@
         </w:pict>
       </w:r>
     </w:p>
-    <w:bookmarkEnd w:id="36"/>
-    <w:bookmarkStart w:id="37" w:name="debrief-2"/>
+    <w:bookmarkEnd w:id="39"/>
+    <w:bookmarkStart w:id="40" w:name="debrief-2"/>
     <w:p>
       <w:pPr>
         <w:pStyle w:val="Heading2"/>
@@ -6783,9 +6838,9 @@
         <w:t xml:space="preserve">Passing tests tell you the code does what you tested. Requirements-derived tests tell you the code does what you specified.</w:t>
       </w:r>
     </w:p>
-    <w:bookmarkEnd w:id="37"/>
-    <w:bookmarkEnd w:id="38"/>
-    <w:bookmarkStart w:id="47" w:name="chapter-4-review-ai-output-like-a-pr"/>
+    <w:bookmarkEnd w:id="40"/>
+    <w:bookmarkEnd w:id="41"/>
+    <w:bookmarkStart w:id="50" w:name="chapter-4-review-ai-output-like-a-pr"/>
     <w:p>
       <w:pPr>
         <w:pStyle w:val="Heading1"/>
@@ -6884,7 +6939,7 @@
         </w:pict>
       </w:r>
     </w:p>
-    <w:bookmarkStart w:id="39" w:name="the-understanding-gap"/>
+    <w:bookmarkStart w:id="42" w:name="the-understanding-gap"/>
     <w:p>
       <w:pPr>
         <w:pStyle w:val="Heading2"/>
@@ -6984,8 +7039,8 @@
         </w:pict>
       </w:r>
     </w:p>
-    <w:bookmarkEnd w:id="39"/>
-    <w:bookmarkStart w:id="40" w:name="the-failure-path-running-without-reading"/>
+    <w:bookmarkEnd w:id="42"/>
+    <w:bookmarkStart w:id="43" w:name="the-failure-path-running-without-reading"/>
     <w:p>
       <w:pPr>
         <w:pStyle w:val="Heading2"/>
@@ -7184,8 +7239,8 @@
         </w:pict>
       </w:r>
     </w:p>
-    <w:bookmarkEnd w:id="40"/>
-    <w:bookmarkStart w:id="41" w:name="the-pr-review-checklist"/>
+    <w:bookmarkEnd w:id="43"/>
+    <w:bookmarkStart w:id="44" w:name="the-pr-review-checklist"/>
     <w:p>
       <w:pPr>
         <w:pStyle w:val="Heading2"/>
@@ -7447,8 +7502,8 @@
         </w:pict>
       </w:r>
     </w:p>
-    <w:bookmarkEnd w:id="41"/>
-    <w:bookmarkStart w:id="45" w:name="three-findings-three-fixes"/>
+    <w:bookmarkEnd w:id="44"/>
+    <w:bookmarkStart w:id="48" w:name="three-findings-three-fixes"/>
     <w:p>
       <w:pPr>
         <w:pStyle w:val="Heading2"/>
@@ -7465,7 +7520,7 @@
         <w:t xml:space="preserve">Here are three findings that commonly appear in the task manager after three chapters of AI generation. Yours may differ; apply the same approach.</w:t>
       </w:r>
     </w:p>
-    <w:bookmarkStart w:id="42" w:name="finding-1-a-function-doing-two-things"/>
+    <w:bookmarkStart w:id="45" w:name="finding-1-a-function-doing-two-things"/>
     <w:p>
       <w:pPr>
         <w:pStyle w:val="Heading3"/>
@@ -7656,8 +7711,8 @@
         <w:t xml:space="preserve">All nine tests still passing. If any fail, the refactor changed behavior — issue a targeted correction identifying the specific test that failed and what it expected.</w:t>
       </w:r>
     </w:p>
-    <w:bookmarkEnd w:id="42"/>
-    <w:bookmarkStart w:id="43" w:name="finding-2-unclear-variable-names"/>
+    <w:bookmarkEnd w:id="45"/>
+    <w:bookmarkStart w:id="46" w:name="finding-2-unclear-variable-names"/>
     <w:p>
       <w:pPr>
         <w:pStyle w:val="Heading3"/>
@@ -7860,8 +7915,8 @@
         <w:t xml:space="preserve">-v</w:t>
       </w:r>
     </w:p>
-    <w:bookmarkEnd w:id="43"/>
-    <w:bookmarkStart w:id="44" w:name="X2a53b715f76d25c3ad1e4b17fff44147c763339"/>
+    <w:bookmarkEnd w:id="46"/>
+    <w:bookmarkStart w:id="47" w:name="X2a53b715f76d25c3ad1e4b17fff44147c763339"/>
     <w:p>
       <w:pPr>
         <w:pStyle w:val="Heading3"/>
@@ -8108,9 +8163,9 @@
         </w:pict>
       </w:r>
     </w:p>
-    <w:bookmarkEnd w:id="44"/>
-    <w:bookmarkEnd w:id="45"/>
-    <w:bookmarkStart w:id="46" w:name="debrief-3"/>
+    <w:bookmarkEnd w:id="47"/>
+    <w:bookmarkEnd w:id="48"/>
+    <w:bookmarkStart w:id="49" w:name="debrief-3"/>
     <w:p>
       <w:pPr>
         <w:pStyle w:val="Heading2"/>
@@ -8208,9 +8263,9 @@
         <w:t xml:space="preserve">Understanding the code is not optional — you are the one who has to change it next.</w:t>
       </w:r>
     </w:p>
-    <w:bookmarkEnd w:id="46"/>
-    <w:bookmarkEnd w:id="47"/>
-    <w:bookmarkStart w:id="56" w:name="chapter-5-iterate-deliberately"/>
+    <w:bookmarkEnd w:id="49"/>
+    <w:bookmarkEnd w:id="50"/>
+    <w:bookmarkStart w:id="59" w:name="chapter-5-iterate-deliberately"/>
     <w:p>
       <w:pPr>
         <w:pStyle w:val="Heading1"/>
@@ -8276,7 +8331,7 @@
         </w:pict>
       </w:r>
     </w:p>
-    <w:bookmarkStart w:id="48" w:name="the-reckless-iteration-trap"/>
+    <w:bookmarkStart w:id="51" w:name="the-reckless-iteration-trap"/>
     <w:p>
       <w:pPr>
         <w:pStyle w:val="Heading2"/>
@@ -8593,8 +8648,8 @@
         </w:pict>
       </w:r>
     </w:p>
-    <w:bookmarkEnd w:id="48"/>
-    <w:bookmarkStart w:id="49" w:name="the-increment-plan"/>
+    <w:bookmarkEnd w:id="51"/>
+    <w:bookmarkStart w:id="52" w:name="the-increment-plan"/>
     <w:p>
       <w:pPr>
         <w:pStyle w:val="Heading2"/>
@@ -9076,8 +9131,8 @@
         </w:pict>
       </w:r>
     </w:p>
-    <w:bookmarkEnd w:id="49"/>
-    <w:bookmarkStart w:id="54" w:name="four-increments-four-verifications"/>
+    <w:bookmarkEnd w:id="52"/>
+    <w:bookmarkStart w:id="57" w:name="four-increments-four-verifications"/>
     <w:p>
       <w:pPr>
         <w:pStyle w:val="Heading2"/>
@@ -9136,7 +9191,7 @@
         <w:t xml:space="preserve">to your last clean commit.</w:t>
       </w:r>
     </w:p>
-    <w:bookmarkStart w:id="50" w:name="increment-1-data-model"/>
+    <w:bookmarkStart w:id="53" w:name="increment-1-data-model"/>
     <w:p>
       <w:pPr>
         <w:pStyle w:val="Heading3"/>
@@ -9576,8 +9631,8 @@
         <w:t xml:space="preserve">All 9 tests passing. If any fail, the increment changed something it should not have. Issue a targeted correction before moving to Increment 2.</w:t>
       </w:r>
     </w:p>
-    <w:bookmarkEnd w:id="50"/>
-    <w:bookmarkStart w:id="51" w:name="increment-2-list-display"/>
+    <w:bookmarkEnd w:id="53"/>
+    <w:bookmarkStart w:id="54" w:name="increment-2-list-display"/>
     <w:p>
       <w:pPr>
         <w:pStyle w:val="Heading3"/>
@@ -9844,8 +9899,8 @@
         <w:t xml:space="preserve">9 tests passing (the updated list-format test now reflects the new output).</w:t>
       </w:r>
     </w:p>
-    <w:bookmarkEnd w:id="51"/>
-    <w:bookmarkStart w:id="52" w:name="increment-3-overdue-command"/>
+    <w:bookmarkEnd w:id="54"/>
+    <w:bookmarkStart w:id="55" w:name="increment-3-overdue-command"/>
     <w:p>
       <w:pPr>
         <w:pStyle w:val="Heading3"/>
@@ -10269,8 +10324,8 @@
         <w:t xml:space="preserve"># Expected: future task does not appear</w:t>
       </w:r>
     </w:p>
-    <w:bookmarkEnd w:id="52"/>
-    <w:bookmarkStart w:id="53" w:name="increment-4-final-verification"/>
+    <w:bookmarkEnd w:id="55"/>
+    <w:bookmarkStart w:id="56" w:name="increment-4-final-verification"/>
     <w:p>
       <w:pPr>
         <w:pStyle w:val="Heading3"/>
@@ -10367,9 +10422,9 @@
         </w:pict>
       </w:r>
     </w:p>
-    <w:bookmarkEnd w:id="53"/>
-    <w:bookmarkEnd w:id="54"/>
-    <w:bookmarkStart w:id="55" w:name="debrief-4"/>
+    <w:bookmarkEnd w:id="56"/>
+    <w:bookmarkEnd w:id="57"/>
+    <w:bookmarkStart w:id="58" w:name="debrief-4"/>
     <w:p>
       <w:pPr>
         <w:pStyle w:val="Heading2"/>
@@ -10439,9 +10494,9 @@
         <w:t xml:space="preserve">One change, verified, before the next. This is how you stay in control of a project the AI is building.</w:t>
       </w:r>
     </w:p>
-    <w:bookmarkEnd w:id="55"/>
-    <w:bookmarkEnd w:id="56"/>
-    <w:bookmarkStart w:id="61" w:name="chapter-6-manage-scope"/>
+    <w:bookmarkEnd w:id="58"/>
+    <w:bookmarkEnd w:id="59"/>
+    <w:bookmarkStart w:id="64" w:name="chapter-6-manage-scope"/>
     <w:p>
       <w:pPr>
         <w:pStyle w:val="Heading1"/>
@@ -10537,7 +10592,7 @@
         </w:pict>
       </w:r>
     </w:p>
-    <w:bookmarkStart w:id="57" w:name="the-gold-plating-problem"/>
+    <w:bookmarkStart w:id="60" w:name="the-gold-plating-problem"/>
     <w:p>
       <w:pPr>
         <w:pStyle w:val="Heading2"/>
@@ -10809,8 +10864,8 @@
         </w:pict>
       </w:r>
     </w:p>
-    <w:bookmarkEnd w:id="57"/>
-    <w:bookmarkStart w:id="58" w:name="scope-as-part-of-the-requirement"/>
+    <w:bookmarkEnd w:id="60"/>
+    <w:bookmarkStart w:id="61" w:name="scope-as-part-of-the-requirement"/>
     <w:p>
       <w:pPr>
         <w:pStyle w:val="Heading2"/>
@@ -11121,8 +11176,8 @@
         </w:pict>
       </w:r>
     </w:p>
-    <w:bookmarkEnd w:id="58"/>
-    <w:bookmarkStart w:id="59" w:name="the-success-path-scoped-search"/>
+    <w:bookmarkEnd w:id="61"/>
+    <w:bookmarkStart w:id="62" w:name="the-success-path-scoped-search"/>
     <w:p>
       <w:pPr>
         <w:pStyle w:val="Heading2"/>
@@ -11895,8 +11950,8 @@
         </w:pict>
       </w:r>
     </w:p>
-    <w:bookmarkEnd w:id="59"/>
-    <w:bookmarkStart w:id="60" w:name="debrief-5"/>
+    <w:bookmarkEnd w:id="62"/>
+    <w:bookmarkStart w:id="63" w:name="debrief-5"/>
     <w:p>
       <w:pPr>
         <w:pStyle w:val="Heading2"/>
@@ -11998,9 +12053,9 @@
         <w:t xml:space="preserve">Specify what you are not building. The AI will build it anyway if you don’t.</w:t>
       </w:r>
     </w:p>
-    <w:bookmarkEnd w:id="60"/>
-    <w:bookmarkEnd w:id="61"/>
-    <w:bookmarkStart w:id="66" w:name="chapter-7-document-decisions"/>
+    <w:bookmarkEnd w:id="63"/>
+    <w:bookmarkEnd w:id="64"/>
+    <w:bookmarkStart w:id="69" w:name="chapter-7-document-decisions"/>
     <w:p>
       <w:pPr>
         <w:pStyle w:val="Heading1"/>
@@ -12111,7 +12166,7 @@
         </w:pict>
       </w:r>
     </w:p>
-    <w:bookmarkStart w:id="62" w:name="the-amnesia-problem"/>
+    <w:bookmarkStart w:id="65" w:name="the-amnesia-problem"/>
     <w:p>
       <w:pPr>
         <w:pStyle w:val="Heading2"/>
@@ -12439,8 +12494,8 @@
         </w:pict>
       </w:r>
     </w:p>
-    <w:bookmarkEnd w:id="62"/>
-    <w:bookmarkStart w:id="63" w:name="writing-decisions.md"/>
+    <w:bookmarkEnd w:id="65"/>
+    <w:bookmarkStart w:id="66" w:name="writing-decisions.md"/>
     <w:p>
       <w:pPr>
         <w:pStyle w:val="Heading2"/>
@@ -12932,8 +12987,8 @@
         </w:pict>
       </w:r>
     </w:p>
-    <w:bookmarkEnd w:id="63"/>
-    <w:bookmarkStart w:id="64" w:name="the-success-path-format-with-context"/>
+    <w:bookmarkEnd w:id="66"/>
+    <w:bookmarkStart w:id="67" w:name="the-success-path-format-with-context"/>
     <w:p>
       <w:pPr>
         <w:pStyle w:val="Heading2"/>
@@ -13554,8 +13609,8 @@
         </w:pict>
       </w:r>
     </w:p>
-    <w:bookmarkEnd w:id="64"/>
-    <w:bookmarkStart w:id="65" w:name="debrief-6"/>
+    <w:bookmarkEnd w:id="67"/>
+    <w:bookmarkStart w:id="68" w:name="debrief-6"/>
     <w:p>
       <w:pPr>
         <w:pStyle w:val="Heading2"/>
@@ -13736,9 +13791,9 @@
         <w:t xml:space="preserve">The AI forgets everything when the session ends. decisions.md doesn’t.</w:t>
       </w:r>
     </w:p>
-    <w:bookmarkEnd w:id="65"/>
-    <w:bookmarkEnd w:id="66"/>
-    <w:bookmarkStart w:id="76" w:name="chapter-8-the-agentflow-loop"/>
+    <w:bookmarkEnd w:id="68"/>
+    <w:bookmarkEnd w:id="69"/>
+    <w:bookmarkStart w:id="79" w:name="chapter-8-the-agentflow-loop"/>
     <w:p>
       <w:pPr>
         <w:pStyle w:val="Heading1"/>
@@ -13810,7 +13865,7 @@
         </w:pict>
       </w:r>
     </w:p>
-    <w:bookmarkStart w:id="67" w:name="the-five-stages"/>
+    <w:bookmarkStart w:id="70" w:name="the-five-stages"/>
     <w:p>
       <w:pPr>
         <w:pStyle w:val="Heading2"/>
@@ -13979,8 +14034,8 @@
         </w:pict>
       </w:r>
     </w:p>
-    <w:bookmarkEnd w:id="67"/>
-    <w:bookmarkStart w:id="68" w:name="the-failure-path-skipping-the-loop"/>
+    <w:bookmarkEnd w:id="70"/>
+    <w:bookmarkStart w:id="71" w:name="the-failure-path-skipping-the-loop"/>
     <w:p>
       <w:pPr>
         <w:pStyle w:val="Heading2"/>
@@ -14213,8 +14268,8 @@
         </w:pict>
       </w:r>
     </w:p>
-    <w:bookmarkEnd w:id="68"/>
-    <w:bookmarkStart w:id="74" w:name="running-the-loop-stats"/>
+    <w:bookmarkEnd w:id="71"/>
+    <w:bookmarkStart w:id="77" w:name="running-the-loop-stats"/>
     <w:p>
       <w:pPr>
         <w:pStyle w:val="Heading2"/>
@@ -14231,7 +14286,7 @@
         <w:t xml:space="preserve">Start over. Close the agent session. Now run the loop explicitly.</w:t>
       </w:r>
     </w:p>
-    <w:bookmarkStart w:id="69" w:name="stage-1-start"/>
+    <w:bookmarkStart w:id="72" w:name="stage-1-start"/>
     <w:p>
       <w:pPr>
         <w:pStyle w:val="Heading3"/>
@@ -14496,8 +14551,8 @@
         </w:pict>
       </w:r>
     </w:p>
-    <w:bookmarkEnd w:id="69"/>
-    <w:bookmarkStart w:id="70" w:name="stage-2-implement"/>
+    <w:bookmarkEnd w:id="72"/>
+    <w:bookmarkStart w:id="73" w:name="stage-2-implement"/>
     <w:p>
       <w:pPr>
         <w:pStyle w:val="Heading3"/>
@@ -14810,8 +14865,8 @@
         <w:t xml:space="preserve">The agent completing without clarifying questions. A well-specified requirement should not require agent questions. If it asks something, the answer is in the requirement — point to the relevant line.</w:t>
       </w:r>
     </w:p>
-    <w:bookmarkEnd w:id="70"/>
-    <w:bookmarkStart w:id="71" w:name="stage-3-verify"/>
+    <w:bookmarkEnd w:id="73"/>
+    <w:bookmarkStart w:id="74" w:name="stage-3-verify"/>
     <w:p>
       <w:pPr>
         <w:pStyle w:val="Heading3"/>
@@ -15136,8 +15191,8 @@
         <w:t xml:space="preserve">Both cases matching the requirement exactly. If the overdue count is wrong, check whether the agent used today’s local date (correct) or UTC (which may differ by timezone).</w:t>
       </w:r>
     </w:p>
-    <w:bookmarkEnd w:id="71"/>
-    <w:bookmarkStart w:id="72" w:name="stage-4-review"/>
+    <w:bookmarkEnd w:id="74"/>
+    <w:bookmarkStart w:id="75" w:name="stage-4-review"/>
     <w:p>
       <w:pPr>
         <w:pStyle w:val="Heading3"/>
@@ -15291,8 +15346,8 @@
         <w:t xml:space="preserve">Any code path the agent added that you cannot explain in one sentence. If found, ask the agent to explain it in a follow-up message before moving on.</w:t>
       </w:r>
     </w:p>
-    <w:bookmarkEnd w:id="72"/>
-    <w:bookmarkStart w:id="73" w:name="stage-5-update"/>
+    <w:bookmarkEnd w:id="75"/>
+    <w:bookmarkStart w:id="76" w:name="stage-5-update"/>
     <w:p>
       <w:pPr>
         <w:pStyle w:val="Heading3"/>
@@ -15432,9 +15487,9 @@
         </w:pict>
       </w:r>
     </w:p>
-    <w:bookmarkEnd w:id="73"/>
-    <w:bookmarkEnd w:id="74"/>
-    <w:bookmarkStart w:id="75" w:name="debrief-7"/>
+    <w:bookmarkEnd w:id="76"/>
+    <w:bookmarkEnd w:id="77"/>
+    <w:bookmarkStart w:id="78" w:name="debrief-7"/>
     <w:p>
       <w:pPr>
         <w:pStyle w:val="Heading2"/>
@@ -15504,9 +15559,9 @@
         <w:t xml:space="preserve">The loop does not make you faster. It makes you traceable — which is what lets you go faster for longer.</w:t>
       </w:r>
     </w:p>
-    <w:bookmarkEnd w:id="75"/>
-    <w:bookmarkEnd w:id="76"/>
-    <w:bookmarkStart w:id="83" w:name="chapter-9-skills-and-autonomy-modes"/>
+    <w:bookmarkEnd w:id="78"/>
+    <w:bookmarkEnd w:id="79"/>
+    <w:bookmarkStart w:id="86" w:name="chapter-9-skills-and-autonomy-modes"/>
     <w:p>
       <w:pPr>
         <w:pStyle w:val="Heading1"/>
@@ -15593,7 +15648,7 @@
         </w:pict>
       </w:r>
     </w:p>
-    <w:bookmarkStart w:id="77" w:name="what-a-skill-is"/>
+    <w:bookmarkStart w:id="80" w:name="what-a-skill-is"/>
     <w:p>
       <w:pPr>
         <w:pStyle w:val="Heading2"/>
@@ -15916,8 +15971,8 @@
         </w:pict>
       </w:r>
     </w:p>
-    <w:bookmarkEnd w:id="77"/>
-    <w:bookmarkStart w:id="78" w:name="writing-start-session.md"/>
+    <w:bookmarkEnd w:id="80"/>
+    <w:bookmarkStart w:id="81" w:name="writing-start-session.md"/>
     <w:p>
       <w:pPr>
         <w:pStyle w:val="Heading2"/>
@@ -16044,8 +16099,8 @@
         </w:pict>
       </w:r>
     </w:p>
-    <w:bookmarkEnd w:id="78"/>
-    <w:bookmarkStart w:id="79" w:name="the-failure-path-without-the-skill"/>
+    <w:bookmarkEnd w:id="81"/>
+    <w:bookmarkStart w:id="82" w:name="the-failure-path-without-the-skill"/>
     <w:p>
       <w:pPr>
         <w:pStyle w:val="Heading2"/>
@@ -16371,8 +16426,8 @@
         </w:pict>
       </w:r>
     </w:p>
-    <w:bookmarkEnd w:id="79"/>
-    <w:bookmarkStart w:id="80" w:name="the-success-path-clear-with-the-skill"/>
+    <w:bookmarkEnd w:id="82"/>
+    <w:bookmarkStart w:id="83" w:name="the-success-path-clear-with-the-skill"/>
     <w:p>
       <w:pPr>
         <w:pStyle w:val="Heading2"/>
@@ -17130,8 +17185,8 @@
         </w:pict>
       </w:r>
     </w:p>
-    <w:bookmarkEnd w:id="80"/>
-    <w:bookmarkStart w:id="81" w:name="autonomy-modes"/>
+    <w:bookmarkEnd w:id="83"/>
+    <w:bookmarkStart w:id="84" w:name="autonomy-modes"/>
     <w:p>
       <w:pPr>
         <w:pStyle w:val="Heading2"/>
@@ -17232,8 +17287,8 @@
         </w:pict>
       </w:r>
     </w:p>
-    <w:bookmarkEnd w:id="81"/>
-    <w:bookmarkStart w:id="82" w:name="debrief-8"/>
+    <w:bookmarkEnd w:id="84"/>
+    <w:bookmarkStart w:id="85" w:name="debrief-8"/>
     <w:p>
       <w:pPr>
         <w:pStyle w:val="Heading2"/>
@@ -17307,9 +17362,9 @@
         <w:t xml:space="preserve">A skill is a discipline made repeatable. Write it once; apply it every session.</w:t>
       </w:r>
     </w:p>
-    <w:bookmarkEnd w:id="82"/>
-    <w:bookmarkEnd w:id="83"/>
-    <w:bookmarkStart w:id="89" w:name="chapter-10-context-files-and-handoffs"/>
+    <w:bookmarkEnd w:id="85"/>
+    <w:bookmarkEnd w:id="86"/>
+    <w:bookmarkStart w:id="92" w:name="chapter-10-context-files-and-handoffs"/>
     <w:p>
       <w:pPr>
         <w:pStyle w:val="Heading1"/>
@@ -17433,7 +17488,7 @@
         </w:pict>
       </w:r>
     </w:p>
-    <w:bookmarkStart w:id="84" w:name="what-context.md-is-and-is-not"/>
+    <w:bookmarkStart w:id="87" w:name="what-context.md-is-and-is-not"/>
     <w:p>
       <w:pPr>
         <w:pStyle w:val="Heading2"/>
@@ -17580,8 +17635,8 @@
         </w:pict>
       </w:r>
     </w:p>
-    <w:bookmarkEnd w:id="84"/>
-    <w:bookmarkStart w:id="85" w:name="writing-context.md"/>
+    <w:bookmarkEnd w:id="87"/>
+    <w:bookmarkStart w:id="88" w:name="writing-context.md"/>
     <w:p>
       <w:pPr>
         <w:pStyle w:val="Heading2"/>
@@ -18020,8 +18075,8 @@
         </w:pict>
       </w:r>
     </w:p>
-    <w:bookmarkEnd w:id="85"/>
-    <w:bookmarkStart w:id="86" w:name="the-failure-path-thin-context.md"/>
+    <w:bookmarkEnd w:id="88"/>
+    <w:bookmarkStart w:id="89" w:name="the-failure-path-thin-context.md"/>
     <w:p>
       <w:pPr>
         <w:pStyle w:val="Heading2"/>
@@ -18171,8 +18226,8 @@
         </w:pict>
       </w:r>
     </w:p>
-    <w:bookmarkEnd w:id="86"/>
-    <w:bookmarkStart w:id="87" w:name="the-handoff-test-full-context.md"/>
+    <w:bookmarkEnd w:id="89"/>
+    <w:bookmarkStart w:id="90" w:name="the-handoff-test-full-context.md"/>
     <w:p>
       <w:pPr>
         <w:pStyle w:val="Heading2"/>
@@ -18411,8 +18466,8 @@
         </w:pict>
       </w:r>
     </w:p>
-    <w:bookmarkEnd w:id="87"/>
-    <w:bookmarkStart w:id="88" w:name="debrief-9"/>
+    <w:bookmarkEnd w:id="90"/>
+    <w:bookmarkStart w:id="91" w:name="debrief-9"/>
     <w:p>
       <w:pPr>
         <w:pStyle w:val="Heading2"/>
@@ -18482,9 +18537,9 @@
         <w:t xml:space="preserve">A complete context file means the next session — whoever runs it — starts with everything they need.</w:t>
       </w:r>
     </w:p>
-    <w:bookmarkEnd w:id="88"/>
-    <w:bookmarkEnd w:id="89"/>
-    <w:bookmarkStart w:id="95" w:name="chapter-11-multi-agent-coordination"/>
+    <w:bookmarkEnd w:id="91"/>
+    <w:bookmarkEnd w:id="92"/>
+    <w:bookmarkStart w:id="98" w:name="chapter-11-multi-agent-coordination"/>
     <w:p>
       <w:pPr>
         <w:pStyle w:val="Heading1"/>
@@ -18553,7 +18608,7 @@
         </w:pict>
       </w:r>
     </w:p>
-    <w:bookmarkStart w:id="90" w:name="when-parallelism-is-safe"/>
+    <w:bookmarkStart w:id="93" w:name="when-parallelism-is-safe"/>
     <w:p>
       <w:pPr>
         <w:pStyle w:val="Heading2"/>
@@ -18725,8 +18780,8 @@
         </w:pict>
       </w:r>
     </w:p>
-    <w:bookmarkEnd w:id="90"/>
-    <w:bookmarkStart w:id="91" w:name="X86f1ff8897765e7547757885b810da800ac0a29"/>
+    <w:bookmarkEnd w:id="93"/>
+    <w:bookmarkStart w:id="94" w:name="X86f1ff8897765e7547757885b810da800ac0a29"/>
     <w:p>
       <w:pPr>
         <w:pStyle w:val="Heading2"/>
@@ -18970,8 +19025,8 @@
         </w:pict>
       </w:r>
     </w:p>
-    <w:bookmarkEnd w:id="91"/>
-    <w:bookmarkStart w:id="92" w:name="the-success-path-scoped-parallel-agents"/>
+    <w:bookmarkEnd w:id="94"/>
+    <w:bookmarkStart w:id="95" w:name="the-success-path-scoped-parallel-agents"/>
     <w:p>
       <w:pPr>
         <w:pStyle w:val="Heading2"/>
@@ -19769,8 +19824,8 @@
         </w:pict>
       </w:r>
     </w:p>
-    <w:bookmarkEnd w:id="92"/>
-    <w:bookmarkStart w:id="93" w:name="the-merge-review"/>
+    <w:bookmarkEnd w:id="95"/>
+    <w:bookmarkStart w:id="96" w:name="the-merge-review"/>
     <w:p>
       <w:pPr>
         <w:pStyle w:val="Heading2"/>
@@ -20003,8 +20058,8 @@
         </w:pict>
       </w:r>
     </w:p>
-    <w:bookmarkEnd w:id="93"/>
-    <w:bookmarkStart w:id="94" w:name="debrief-10"/>
+    <w:bookmarkEnd w:id="96"/>
+    <w:bookmarkStart w:id="97" w:name="debrief-10"/>
     <w:p>
       <w:pPr>
         <w:pStyle w:val="Heading2"/>
@@ -20066,9 +20121,9 @@
         <w:t xml:space="preserve">Parallelism is a throughput multiplier, not a coordination shortcut. The discipline still runs once per agent.</w:t>
       </w:r>
     </w:p>
-    <w:bookmarkEnd w:id="94"/>
-    <w:bookmarkEnd w:id="95"/>
-    <w:bookmarkStart w:id="104" w:name="chapter-12-the-sprint-cadence"/>
+    <w:bookmarkEnd w:id="97"/>
+    <w:bookmarkEnd w:id="98"/>
+    <w:bookmarkStart w:id="107" w:name="chapter-12-the-sprint-cadence"/>
     <w:p>
       <w:pPr>
         <w:pStyle w:val="Heading1"/>
@@ -20134,7 +20189,7 @@
         </w:pict>
       </w:r>
     </w:p>
-    <w:bookmarkStart w:id="96" w:name="what-sprint-planning-produces"/>
+    <w:bookmarkStart w:id="99" w:name="what-sprint-planning-produces"/>
     <w:p>
       <w:pPr>
         <w:pStyle w:val="Heading2"/>
@@ -20387,8 +20442,8 @@
         </w:pict>
       </w:r>
     </w:p>
-    <w:bookmarkEnd w:id="96"/>
-    <w:bookmarkStart w:id="97" w:name="the-failure-path-no-plan"/>
+    <w:bookmarkEnd w:id="99"/>
+    <w:bookmarkStart w:id="100" w:name="the-failure-path-no-plan"/>
     <w:p>
       <w:pPr>
         <w:pStyle w:val="Heading2"/>
@@ -20701,8 +20756,8 @@
         </w:pict>
       </w:r>
     </w:p>
-    <w:bookmarkEnd w:id="97"/>
-    <w:bookmarkStart w:id="98" w:name="writing-the-sprint-plan"/>
+    <w:bookmarkEnd w:id="100"/>
+    <w:bookmarkStart w:id="101" w:name="writing-the-sprint-plan"/>
     <w:p>
       <w:pPr>
         <w:pStyle w:val="Heading2"/>
@@ -21266,8 +21321,8 @@
         </w:pict>
       </w:r>
     </w:p>
-    <w:bookmarkEnd w:id="98"/>
-    <w:bookmarkStart w:id="101" w:name="executing-the-sprint"/>
+    <w:bookmarkEnd w:id="101"/>
+    <w:bookmarkStart w:id="104" w:name="executing-the-sprint"/>
     <w:p>
       <w:pPr>
         <w:pStyle w:val="Heading2"/>
@@ -21276,7 +21331,7 @@
         <w:t xml:space="preserve">Executing the Sprint</w:t>
       </w:r>
     </w:p>
-    <w:bookmarkStart w:id="99" w:name="session-1-format-csv-agent-a"/>
+    <w:bookmarkStart w:id="102" w:name="session-1-format-csv-agent-a"/>
     <w:p>
       <w:pPr>
         <w:pStyle w:val="Heading3"/>
@@ -21679,8 +21734,8 @@
         <w:t xml:space="preserve"># 2,Fix bug,false,high,2026-04-01</w:t>
       </w:r>
     </w:p>
-    <w:bookmarkEnd w:id="99"/>
-    <w:bookmarkStart w:id="100" w:name="session-2-export-command-agent-b"/>
+    <w:bookmarkEnd w:id="102"/>
+    <w:bookmarkStart w:id="103" w:name="session-2-export-command-agent-b"/>
     <w:p>
       <w:pPr>
         <w:pStyle w:val="Heading3"/>
@@ -22060,9 +22115,9 @@
         </w:pict>
       </w:r>
     </w:p>
-    <w:bookmarkEnd w:id="100"/>
-    <w:bookmarkEnd w:id="101"/>
-    <w:bookmarkStart w:id="102" w:name="sprint-review"/>
+    <w:bookmarkEnd w:id="103"/>
+    <w:bookmarkEnd w:id="104"/>
+    <w:bookmarkStart w:id="105" w:name="sprint-review"/>
     <w:p>
       <w:pPr>
         <w:pStyle w:val="Heading2"/>
@@ -22246,8 +22301,8 @@
         </w:pict>
       </w:r>
     </w:p>
-    <w:bookmarkEnd w:id="102"/>
-    <w:bookmarkStart w:id="103" w:name="debrief-11"/>
+    <w:bookmarkEnd w:id="105"/>
+    <w:bookmarkStart w:id="106" w:name="debrief-11"/>
     <w:p>
       <w:pPr>
         <w:pStyle w:val="Heading2"/>
@@ -22317,9 +22372,9 @@
         <w:t xml:space="preserve">A sprint is the unit of coherence. Plan before you execute. Review before you close.</w:t>
       </w:r>
     </w:p>
-    <w:bookmarkEnd w:id="103"/>
-    <w:bookmarkEnd w:id="104"/>
-    <w:bookmarkStart w:id="115" w:name="chapter-13-autonomy-at-scale"/>
+    <w:bookmarkEnd w:id="106"/>
+    <w:bookmarkEnd w:id="107"/>
+    <w:bookmarkStart w:id="118" w:name="chapter-13-autonomy-at-scale"/>
     <w:p>
       <w:pPr>
         <w:pStyle w:val="Heading1"/>
@@ -22425,7 +22480,7 @@
         </w:pict>
       </w:r>
     </w:p>
-    <w:bookmarkStart w:id="105" w:name="the-calibration-heuristic"/>
+    <w:bookmarkStart w:id="108" w:name="the-calibration-heuristic"/>
     <w:p>
       <w:pPr>
         <w:pStyle w:val="Heading2"/>
@@ -22709,8 +22764,8 @@
         </w:pict>
       </w:r>
     </w:p>
-    <w:bookmarkEnd w:id="105"/>
-    <w:bookmarkStart w:id="106" w:name="mode-2-in-practice-done-filter"/>
+    <w:bookmarkEnd w:id="108"/>
+    <w:bookmarkStart w:id="109" w:name="mode-2-in-practice-done-filter"/>
     <w:p>
       <w:pPr>
         <w:pStyle w:val="Heading2"/>
@@ -23174,8 +23229,8 @@
         </w:pict>
       </w:r>
     </w:p>
-    <w:bookmarkEnd w:id="106"/>
-    <w:bookmarkStart w:id="112" w:name="mode-1-in-practice-tag-field"/>
+    <w:bookmarkEnd w:id="109"/>
+    <w:bookmarkStart w:id="115" w:name="mode-1-in-practice-tag-field"/>
     <w:p>
       <w:pPr>
         <w:pStyle w:val="Heading2"/>
@@ -23307,7 +23362,7 @@
         <w:t xml:space="preserve">: Mode 1. Human present at every stage. Review the schema change before proceeding.</w:t>
       </w:r>
     </w:p>
-    <w:bookmarkStart w:id="107" w:name="stage-1-start-and-requirement"/>
+    <w:bookmarkStart w:id="110" w:name="stage-1-start-and-requirement"/>
     <w:p>
       <w:pPr>
         <w:pStyle w:val="Heading3"/>
@@ -23599,8 +23654,8 @@
         </w:pict>
       </w:r>
     </w:p>
-    <w:bookmarkEnd w:id="107"/>
-    <w:bookmarkStart w:id="108" w:name="stage-2-implement-1"/>
+    <w:bookmarkEnd w:id="110"/>
+    <w:bookmarkStart w:id="111" w:name="stage-2-implement-1"/>
     <w:p>
       <w:pPr>
         <w:pStyle w:val="Heading3"/>
@@ -23840,8 +23895,8 @@
         <w:t xml:space="preserve">“Everything looks good — please run the test suite now.”</w:t>
       </w:r>
     </w:p>
-    <w:bookmarkEnd w:id="108"/>
-    <w:bookmarkStart w:id="109" w:name="stage-3-verify-1"/>
+    <w:bookmarkEnd w:id="111"/>
+    <w:bookmarkStart w:id="112" w:name="stage-3-verify-1"/>
     <w:p>
       <w:pPr>
         <w:pStyle w:val="Heading3"/>
@@ -23952,8 +24007,8 @@
         <w:t xml:space="preserve"># Expected: the task displays without any tag — no error, no "[tag: null]"</w:t>
       </w:r>
     </w:p>
-    <w:bookmarkEnd w:id="109"/>
-    <w:bookmarkStart w:id="110" w:name="stage-4-review-1"/>
+    <w:bookmarkEnd w:id="112"/>
+    <w:bookmarkStart w:id="113" w:name="stage-4-review-1"/>
     <w:p>
       <w:pPr>
         <w:pStyle w:val="Heading3"/>
@@ -24015,8 +24070,8 @@
         <w:t xml:space="preserve">in the output? Is the display consistent with the requirement’s examples?</w:t>
       </w:r>
     </w:p>
-    <w:bookmarkEnd w:id="110"/>
-    <w:bookmarkStart w:id="111" w:name="stage-5-update-1"/>
+    <w:bookmarkEnd w:id="113"/>
+    <w:bookmarkStart w:id="114" w:name="stage-5-update-1"/>
     <w:p>
       <w:pPr>
         <w:pStyle w:val="Heading3"/>
@@ -24155,9 +24210,9 @@
         </w:pict>
       </w:r>
     </w:p>
-    <w:bookmarkEnd w:id="111"/>
-    <w:bookmarkEnd w:id="112"/>
-    <w:bookmarkStart w:id="113" w:name="mode-3-when-and-why"/>
+    <w:bookmarkEnd w:id="114"/>
+    <w:bookmarkEnd w:id="115"/>
+    <w:bookmarkStart w:id="116" w:name="mode-3-when-and-why"/>
     <w:p>
       <w:pPr>
         <w:pStyle w:val="Heading2"/>
@@ -24379,8 +24434,8 @@
         </w:pict>
       </w:r>
     </w:p>
-    <w:bookmarkEnd w:id="113"/>
-    <w:bookmarkStart w:id="114" w:name="debrief-12"/>
+    <w:bookmarkEnd w:id="116"/>
+    <w:bookmarkStart w:id="117" w:name="debrief-12"/>
     <w:p>
       <w:pPr>
         <w:pStyle w:val="Heading2"/>
@@ -24474,9 +24529,9 @@
         <w:t xml:space="preserve">Autonomy is calibrated, not maximized. The right mode is the one that matches the task’s risk to your safety net’s coverage.</w:t>
       </w:r>
     </w:p>
-    <w:bookmarkEnd w:id="114"/>
-    <w:bookmarkEnd w:id="115"/>
-    <w:bookmarkStart w:id="129" w:name="chapter-14-putting-it-all-together"/>
+    <w:bookmarkEnd w:id="117"/>
+    <w:bookmarkEnd w:id="118"/>
+    <w:bookmarkStart w:id="132" w:name="chapter-14-putting-it-all-together"/>
     <w:p>
       <w:pPr>
         <w:pStyle w:val="Heading1"/>
@@ -24691,7 +24746,7 @@
         </w:pict>
       </w:r>
     </w:p>
-    <w:bookmarkStart w:id="116" w:name="choosing-your-next-feature"/>
+    <w:bookmarkStart w:id="119" w:name="choosing-your-next-feature"/>
     <w:p>
       <w:pPr>
         <w:pStyle w:val="Heading2"/>
@@ -24924,8 +24979,8 @@
         </w:pict>
       </w:r>
     </w:p>
-    <w:bookmarkEnd w:id="116"/>
-    <w:bookmarkStart w:id="125" w:name="running-the-full-session"/>
+    <w:bookmarkEnd w:id="119"/>
+    <w:bookmarkStart w:id="128" w:name="running-the-full-session"/>
     <w:p>
       <w:pPr>
         <w:pStyle w:val="Heading2"/>
@@ -24942,7 +24997,7 @@
         <w:t xml:space="preserve">This is a checklist, not a tutorial. You have done every step before. The point of this chapter is to do them all in sequence, consciously, as one system.</w:t>
       </w:r>
     </w:p>
-    <w:bookmarkStart w:id="117" w:name="step-1-write-the-sprint-plan"/>
+    <w:bookmarkStart w:id="120" w:name="step-1-write-the-sprint-plan"/>
     <w:p>
       <w:pPr>
         <w:pStyle w:val="Heading3"/>
@@ -25021,8 +25076,8 @@
         <w:t xml:space="preserve">Reference: Chapter 12.</w:t>
       </w:r>
     </w:p>
-    <w:bookmarkEnd w:id="117"/>
-    <w:bookmarkStart w:id="118" w:name="step-2-calibrate-the-autonomy-mode"/>
+    <w:bookmarkEnd w:id="120"/>
+    <w:bookmarkStart w:id="121" w:name="step-2-calibrate-the-autonomy-mode"/>
     <w:p>
       <w:pPr>
         <w:pStyle w:val="Heading3"/>
@@ -25073,8 +25128,8 @@
         <w:t xml:space="preserve">Reference: Chapter 13.</w:t>
       </w:r>
     </w:p>
-    <w:bookmarkEnd w:id="118"/>
-    <w:bookmarkStart w:id="119" w:name="step-3-write-the-requirement"/>
+    <w:bookmarkEnd w:id="121"/>
+    <w:bookmarkStart w:id="122" w:name="step-3-write-the-requirement"/>
     <w:p>
       <w:pPr>
         <w:pStyle w:val="Heading3"/>
@@ -25135,8 +25190,8 @@
         <w:t xml:space="preserve">Reference: Chapter 2.</w:t>
       </w:r>
     </w:p>
-    <w:bookmarkEnd w:id="119"/>
-    <w:bookmarkStart w:id="120" w:name="step-4-invoke-start-session.md"/>
+    <w:bookmarkEnd w:id="122"/>
+    <w:bookmarkStart w:id="123" w:name="step-4-invoke-start-session.md"/>
     <w:p>
       <w:pPr>
         <w:pStyle w:val="Heading3"/>
@@ -25192,8 +25247,8 @@
         <w:t xml:space="preserve">so the agent knows whether to pause.</w:t>
       </w:r>
     </w:p>
-    <w:bookmarkEnd w:id="120"/>
-    <w:bookmarkStart w:id="121" w:name="step-5-implement-and-verify"/>
+    <w:bookmarkEnd w:id="123"/>
+    <w:bookmarkStart w:id="124" w:name="step-5-implement-and-verify"/>
     <w:p>
       <w:pPr>
         <w:pStyle w:val="Heading3"/>
@@ -25251,8 +25306,8 @@
         <w:t xml:space="preserve">All existing tests still passing, plus the new test you specified. If tests fail, issue a targeted correction identifying the specific failing test and the expected behavior.</w:t>
       </w:r>
     </w:p>
-    <w:bookmarkEnd w:id="121"/>
-    <w:bookmarkStart w:id="122" w:name="step-6-review-the-diff"/>
+    <w:bookmarkEnd w:id="124"/>
+    <w:bookmarkStart w:id="125" w:name="step-6-review-the-diff"/>
     <w:p>
       <w:pPr>
         <w:pStyle w:val="Heading3"/>
@@ -25322,8 +25377,8 @@
         <w:t xml:space="preserve">If yes to any, issue a targeted correction before moving on.</w:t>
       </w:r>
     </w:p>
-    <w:bookmarkEnd w:id="122"/>
-    <w:bookmarkStart w:id="123" w:name="step-7-update-artifacts"/>
+    <w:bookmarkEnd w:id="125"/>
+    <w:bookmarkStart w:id="126" w:name="step-7-update-artifacts"/>
     <w:p>
       <w:pPr>
         <w:pStyle w:val="Heading3"/>
@@ -25348,8 +25403,8 @@
         <w:t xml:space="preserve">Close the agent session.</w:t>
       </w:r>
     </w:p>
-    <w:bookmarkEnd w:id="123"/>
-    <w:bookmarkStart w:id="124" w:name="step-8-verify-the-handoff"/>
+    <w:bookmarkEnd w:id="126"/>
+    <w:bookmarkStart w:id="127" w:name="step-8-verify-the-handoff"/>
     <w:p>
       <w:pPr>
         <w:pStyle w:val="Heading3"/>
@@ -25373,9 +25428,9 @@
         </w:pict>
       </w:r>
     </w:p>
-    <w:bookmarkEnd w:id="124"/>
-    <w:bookmarkEnd w:id="125"/>
-    <w:bookmarkStart w:id="126" w:name="what-you-now-have"/>
+    <w:bookmarkEnd w:id="127"/>
+    <w:bookmarkEnd w:id="128"/>
+    <w:bookmarkStart w:id="129" w:name="what-you-now-have"/>
     <w:p>
       <w:pPr>
         <w:pStyle w:val="Heading2"/>
@@ -25606,8 +25661,8 @@
         </w:pict>
       </w:r>
     </w:p>
-    <w:bookmarkEnd w:id="126"/>
-    <w:bookmarkStart w:id="127" w:name="the-closing-argument"/>
+    <w:bookmarkEnd w:id="129"/>
+    <w:bookmarkStart w:id="130" w:name="the-closing-argument"/>
     <w:p>
       <w:pPr>
         <w:pStyle w:val="Heading2"/>
@@ -25673,8 +25728,8 @@
         </w:pict>
       </w:r>
     </w:p>
-    <w:bookmarkEnd w:id="127"/>
-    <w:bookmarkStart w:id="128" w:name="what-comes-next"/>
+    <w:bookmarkEnd w:id="130"/>
+    <w:bookmarkStart w:id="131" w:name="what-comes-next"/>
     <w:p>
       <w:pPr>
         <w:pStyle w:val="Heading2"/>
@@ -25726,9 +25781,9 @@
         <w:t xml:space="preserve">The discipline did not change. The medium did.</w:t>
       </w:r>
     </w:p>
-    <w:bookmarkEnd w:id="128"/>
-    <w:bookmarkEnd w:id="129"/>
-    <w:bookmarkStart w:id="137" w:name="conclusion"/>
+    <w:bookmarkEnd w:id="131"/>
+    <w:bookmarkEnd w:id="132"/>
+    <w:bookmarkStart w:id="140" w:name="conclusion"/>
     <w:p>
       <w:pPr>
         <w:pStyle w:val="Heading1"/>
@@ -25776,7 +25831,7 @@
         </w:pict>
       </w:r>
     </w:p>
-    <w:bookmarkStart w:id="130" w:name="what-you-can-do-now"/>
+    <w:bookmarkStart w:id="133" w:name="what-you-can-do-now"/>
     <w:p>
       <w:pPr>
         <w:pStyle w:val="Heading2"/>
@@ -25976,8 +26031,8 @@
         </w:pict>
       </w:r>
     </w:p>
-    <w:bookmarkEnd w:id="130"/>
-    <w:bookmarkStart w:id="131" w:name="the-disciplines-restated"/>
+    <w:bookmarkEnd w:id="133"/>
+    <w:bookmarkStart w:id="134" w:name="the-disciplines-restated"/>
     <w:p>
       <w:pPr>
         <w:pStyle w:val="Heading2"/>
@@ -26035,8 +26090,8 @@
         </w:pict>
       </w:r>
     </w:p>
-    <w:bookmarkEnd w:id="131"/>
-    <w:bookmarkStart w:id="132" w:name="agentflow-beyond-this-book"/>
+    <w:bookmarkEnd w:id="134"/>
+    <w:bookmarkStart w:id="135" w:name="agentflow-beyond-this-book"/>
     <w:p>
       <w:pPr>
         <w:pStyle w:val="Heading2"/>
@@ -26132,8 +26187,8 @@
         </w:pict>
       </w:r>
     </w:p>
-    <w:bookmarkEnd w:id="132"/>
-    <w:bookmarkStart w:id="133" w:name="what-this-book-does-not-cover"/>
+    <w:bookmarkEnd w:id="135"/>
+    <w:bookmarkStart w:id="136" w:name="what-this-book-does-not-cover"/>
     <w:p>
       <w:pPr>
         <w:pStyle w:val="Heading2"/>
@@ -26237,8 +26292,8 @@
         </w:pict>
       </w:r>
     </w:p>
-    <w:bookmarkEnd w:id="133"/>
-    <w:bookmarkStart w:id="134" w:name="the-tools-will-change"/>
+    <w:bookmarkEnd w:id="136"/>
+    <w:bookmarkStart w:id="137" w:name="the-tools-will-change"/>
     <w:p>
       <w:pPr>
         <w:pStyle w:val="Heading2"/>
@@ -26286,8 +26341,8 @@
         </w:pict>
       </w:r>
     </w:p>
-    <w:bookmarkEnd w:id="134"/>
-    <w:bookmarkStart w:id="135" w:name="adapt-the-system-do-not-adopt-it-blindly"/>
+    <w:bookmarkEnd w:id="137"/>
+    <w:bookmarkStart w:id="138" w:name="adapt-the-system-do-not-adopt-it-blindly"/>
     <w:p>
       <w:pPr>
         <w:pStyle w:val="Heading2"/>
@@ -26335,8 +26390,8 @@
         </w:pict>
       </w:r>
     </w:p>
-    <w:bookmarkEnd w:id="135"/>
-    <w:bookmarkStart w:id="136" w:name="what-comes-next-1"/>
+    <w:bookmarkEnd w:id="138"/>
+    <w:bookmarkStart w:id="139" w:name="what-comes-next-1"/>
     <w:p>
       <w:pPr>
         <w:pStyle w:val="Heading2"/>
@@ -26396,8 +26451,8 @@
         <w:t xml:space="preserve">The AI increased execution speed. You increased the quality of what gets executed. That is the whole game.</w:t>
       </w:r>
     </w:p>
-    <w:bookmarkEnd w:id="136"/>
-    <w:bookmarkEnd w:id="137"/>
+    <w:bookmarkEnd w:id="139"/>
+    <w:bookmarkEnd w:id="140"/>
     <w:sectPr>
       <w:footnotePr>
         <w:numRestart w:val="eachSect"/>

</xml_diff>